<commit_message>
vault backup: 2026-06-05 11:19:39
</commit_message>
<xml_diff>
--- a/Spring 2026/2400-DS1AE # Advanced Econometrics/eurpln_project/04_report.docx
+++ b/Spring 2026/2400-DS1AE # Advanced Econometrics/eurpln_project/04_report.docx
@@ -23,7 +23,7 @@
         <w:pStyle w:val="Date"/>
       </w:pPr>
       <w:r>
-        <w:t xml:space="preserve">02 June 2026</w:t>
+        <w:t xml:space="preserve">05 June 2026</w:t>
       </w:r>
     </w:p>
     <w:sdt>
@@ -93,31 +93,71 @@
         <w:t xml:space="preserve"> </w:t>
       </w:r>
       <w:r>
-        <w:t xml:space="preserve">(173 months). I first test if the series are stationary, then I look for</w:t>
-      </w:r>
-      <w:r>
-        <w:t xml:space="preserve"> </w:t>
-      </w:r>
-      <w:r>
-        <w:t xml:space="preserve">a long-run link using cointegration tests and an ARDL model. I also add Brent oil</w:t>
-      </w:r>
-      <w:r>
-        <w:t xml:space="preserve"> </w:t>
-      </w:r>
-      <w:r>
-        <w:t xml:space="preserve">as a control and use a simple ARIMA model as a benchmark. [Write the main result</w:t>
-      </w:r>
-      <w:r>
-        <w:t xml:space="preserve"> </w:t>
-      </w:r>
-      <w:r>
-        <w:t xml:space="preserve">here once the models are run — for example, whether I find a long-run link and</w:t>
-      </w:r>
-      <w:r>
-        <w:t xml:space="preserve"> </w:t>
-      </w:r>
-      <w:r>
-        <w:t xml:space="preserve">how fast the exchange rate goes back to it.]</w:t>
+        <w:t xml:space="preserve">(173 months). I test if the series are stationary, then I look for a</w:t>
+      </w:r>
+      <w:r>
+        <w:t xml:space="preserve"> </w:t>
+      </w:r>
+      <w:r>
+        <w:t xml:space="preserve">long-run link with cointegration tests and an ARDL model, with Brent oil as a</w:t>
+      </w:r>
+      <w:r>
+        <w:t xml:space="preserve"> </w:t>
+      </w:r>
+      <w:r>
+        <w:t xml:space="preserve">control and a simple ARIMA model as a benchmark. My main result is that all</w:t>
+      </w:r>
+      <w:r>
+        <w:t xml:space="preserve"> </w:t>
+      </w:r>
+      <w:r>
+        <w:t xml:space="preserve">series are non-stationary (I(1)), but I find</w:t>
+      </w:r>
+      <w:r>
+        <w:t xml:space="preserve"> </w:t>
+      </w:r>
+      <w:r>
+        <w:rPr>
+          <w:b/>
+          <w:bCs/>
+        </w:rPr>
+        <w:t xml:space="preserve">no stable long-run link</w:t>
+      </w:r>
+      <w:r>
+        <w:t xml:space="preserve"> </w:t>
+      </w:r>
+      <w:r>
+        <w:t xml:space="preserve">between</w:t>
+      </w:r>
+      <w:r>
+        <w:t xml:space="preserve"> </w:t>
+      </w:r>
+      <w:r>
+        <w:t xml:space="preserve">the exchange rate and the interest rate gap: the Phillips–Ouliaris test and the</w:t>
+      </w:r>
+      <w:r>
+        <w:t xml:space="preserve"> </w:t>
+      </w:r>
+      <w:r>
+        <w:t xml:space="preserve">ARDL bounds test both reject a long-run relationship, and the stability tests</w:t>
+      </w:r>
+      <w:r>
+        <w:t xml:space="preserve"> </w:t>
+      </w:r>
+      <w:r>
+        <w:t xml:space="preserve">show the link breaks around 2020–2022. The exchange rate behaves close to a</w:t>
+      </w:r>
+      <w:r>
+        <w:t xml:space="preserve"> </w:t>
+      </w:r>
+      <w:r>
+        <w:t xml:space="preserve">random walk, which my ARIMA benchmark confirms. This fits the well-known finding</w:t>
+      </w:r>
+      <w:r>
+        <w:t xml:space="preserve"> </w:t>
+      </w:r>
+      <w:r>
+        <w:t xml:space="preserve">that exchange rates are hard to predict and that interest-parity links are weak.</w:t>
       </w:r>
     </w:p>
     <w:bookmarkEnd w:id="9"/>
@@ -282,17 +322,121 @@
         <w:pStyle w:val="FirstParagraph"/>
       </w:pPr>
       <w:r>
-        <w:rPr>
-          <w:b/>
-          <w:bCs/>
-        </w:rPr>
-        <w:t xml:space="preserve">Exchange rates and UIP.</w:t>
-      </w:r>
-      <w:r>
-        <w:t xml:space="preserve"> </w:t>
-      </w:r>
-      <w:r>
-        <w:t xml:space="preserve">A famous result by</w:t>
+        <w:t xml:space="preserve">The link between interest rates and exchange rates goes back to uncovered</w:t>
+      </w:r>
+      <w:r>
+        <w:t xml:space="preserve"> </w:t>
+      </w:r>
+      <w:r>
+        <w:t xml:space="preserve">interest parity (UIP). In practice UIP usually fails in the short run but works</w:t>
+      </w:r>
+      <w:r>
+        <w:t xml:space="preserve"> </w:t>
+      </w:r>
+      <w:r>
+        <w:t xml:space="preserve">better over long horizons</w:t>
+      </w:r>
+      <w:r>
+        <w:t xml:space="preserve"> </w:t>
+      </w:r>
+      <w:r>
+        <w:t xml:space="preserve">(Fama 1984; Chinn and Meredith 2004)</w:t>
+      </w:r>
+      <w:r>
+        <w:t xml:space="preserve">, which is why I use a long-run</w:t>
+      </w:r>
+      <w:r>
+        <w:t xml:space="preserve"> </w:t>
+      </w:r>
+      <w:r>
+        <w:t xml:space="preserve">framework.</w:t>
+      </w:r>
+      <w:r>
+        <w:t xml:space="preserve"> </w:t>
+      </w:r>
+      <w:r>
+        <w:t xml:space="preserve">MacDonald and Nagayasu (2000)</w:t>
+      </w:r>
+      <w:r>
+        <w:t xml:space="preserve"> </w:t>
+      </w:r>
+      <w:r>
+        <w:t xml:space="preserve">find a long-run link between interest rate gaps and</w:t>
+      </w:r>
+      <w:r>
+        <w:t xml:space="preserve"> </w:t>
+      </w:r>
+      <w:r>
+        <w:t xml:space="preserve">exchange rates for large economies, while</w:t>
+      </w:r>
+      <w:r>
+        <w:t xml:space="preserve"> </w:t>
+      </w:r>
+      <w:r>
+        <w:t xml:space="preserve">Frankel and Poonawala (2010)</w:t>
+      </w:r>
+      <w:r>
+        <w:t xml:space="preserve"> </w:t>
+      </w:r>
+      <w:r>
+        <w:t xml:space="preserve">show that emerging-market</w:t>
+      </w:r>
+      <w:r>
+        <w:t xml:space="preserve"> </w:t>
+      </w:r>
+      <w:r>
+        <w:t xml:space="preserve">currencies can behave differently. For the methods I follow the standard</w:t>
+      </w:r>
+      <w:r>
+        <w:t xml:space="preserve"> </w:t>
+      </w:r>
+      <w:r>
+        <w:t xml:space="preserve">time-series toolkit: unit-root tests</w:t>
+      </w:r>
+      <w:r>
+        <w:t xml:space="preserve"> </w:t>
+      </w:r>
+      <w:r>
+        <w:t xml:space="preserve">(Dickey and Fuller 1979; Kwiatkowski et al. 1992)</w:t>
+      </w:r>
+      <w:r>
+        <w:t xml:space="preserve">,</w:t>
+      </w:r>
+      <w:r>
+        <w:t xml:space="preserve"> </w:t>
+      </w:r>
+      <w:r>
+        <w:t xml:space="preserve">cointegration tests</w:t>
+      </w:r>
+      <w:r>
+        <w:t xml:space="preserve"> </w:t>
+      </w:r>
+      <w:r>
+        <w:t xml:space="preserve">(Engle and Granger 1987; Johansen 1988; Phillips and Ouliaris 1990)</w:t>
+      </w:r>
+      <w:r>
+        <w:t xml:space="preserve">, and the ARDL</w:t>
+      </w:r>
+      <w:r>
+        <w:t xml:space="preserve"> </w:t>
+      </w:r>
+      <w:r>
+        <w:t xml:space="preserve">bounds test</w:t>
+      </w:r>
+      <w:r>
+        <w:t xml:space="preserve"> </w:t>
+      </w:r>
+      <w:r>
+        <w:t xml:space="preserve">(Pesaran et al. 2001)</w:t>
+      </w:r>
+      <w:r>
+        <w:t xml:space="preserve">. I also keep a simple random-walk benchmark in mind,</w:t>
+      </w:r>
+      <w:r>
+        <w:t xml:space="preserve"> </w:t>
+      </w:r>
+      <w:r>
+        <w:t xml:space="preserve">since</w:t>
       </w:r>
       <w:r>
         <w:t xml:space="preserve"> </w:t>
@@ -304,241 +448,7 @@
         <w:t xml:space="preserve"> </w:t>
       </w:r>
       <w:r>
-        <w:t xml:space="preserve">showed that complex</w:t>
-      </w:r>
-      <w:r>
-        <w:t xml:space="preserve"> </w:t>
-      </w:r>
-      <w:r>
-        <w:t xml:space="preserve">exchange-rate models often cannot beat a simple random walk in short-run</w:t>
-      </w:r>
-      <w:r>
-        <w:t xml:space="preserve"> </w:t>
-      </w:r>
-      <w:r>
-        <w:t xml:space="preserve">forecasts. That is why I also include a basic ARIMA model as a benchmark.</w:t>
-      </w:r>
-      <w:r>
-        <w:t xml:space="preserve"> </w:t>
-      </w:r>
-      <w:r>
-        <w:t xml:space="preserve">Fama (1984)</w:t>
-      </w:r>
-      <w:r>
-        <w:t xml:space="preserve"> </w:t>
-      </w:r>
-      <w:r>
-        <w:t xml:space="preserve">found that interest rate gaps are biased predictors of future currency</w:t>
-      </w:r>
-      <w:r>
-        <w:t xml:space="preserve"> </w:t>
-      </w:r>
-      <w:r>
-        <w:t xml:space="preserve">moves (the</w:t>
-      </w:r>
-      <w:r>
-        <w:t xml:space="preserve"> </w:t>
-      </w:r>
-      <w:r>
-        <w:t xml:space="preserve">“forward premium puzzle”</w:t>
-      </w:r>
-      <w:r>
-        <w:t xml:space="preserve">). Later,</w:t>
-      </w:r>
-      <w:r>
-        <w:t xml:space="preserve"> </w:t>
-      </w:r>
-      <w:r>
-        <w:t xml:space="preserve">Chinn and Meredith (2004)</w:t>
-      </w:r>
-      <w:r>
-        <w:t xml:space="preserve"> </w:t>
-      </w:r>
-      <w:r>
-        <w:t xml:space="preserve">showed that UIP works</w:t>
-      </w:r>
-      <w:r>
-        <w:t xml:space="preserve"> </w:t>
-      </w:r>
-      <w:r>
-        <w:t xml:space="preserve">much better over long horizons, which is why I focus on a long-run model instead</w:t>
-      </w:r>
-      <w:r>
-        <w:t xml:space="preserve"> </w:t>
-      </w:r>
-      <w:r>
-        <w:t xml:space="preserve">of a short-run one.</w:t>
-      </w:r>
-    </w:p>
-    <w:p>
-      <w:pPr>
-        <w:pStyle w:val="BodyText"/>
-      </w:pPr>
-      <w:r>
-        <w:rPr>
-          <w:b/>
-          <w:bCs/>
-        </w:rPr>
-        <w:t xml:space="preserve">Interest rates and exchange rates in the long run.</w:t>
-      </w:r>
-      <w:r>
-        <w:t xml:space="preserve"> </w:t>
-      </w:r>
-      <w:r>
-        <w:t xml:space="preserve">MacDonald and Nagayasu (2000)</w:t>
-      </w:r>
-      <w:r>
-        <w:t xml:space="preserve"> </w:t>
-      </w:r>
-      <w:r>
-        <w:t xml:space="preserve">found a</w:t>
-      </w:r>
-      <w:r>
-        <w:t xml:space="preserve"> </w:t>
-      </w:r>
-      <w:r>
-        <w:t xml:space="preserve">long-run link between real exchange rates and real interest rate gaps for the G7</w:t>
-      </w:r>
-      <w:r>
-        <w:t xml:space="preserve"> </w:t>
-      </w:r>
-      <w:r>
-        <w:t xml:space="preserve">countries. This supports the idea of treating the interest rate gap as a long-run</w:t>
-      </w:r>
-      <w:r>
-        <w:t xml:space="preserve"> </w:t>
-      </w:r>
-      <w:r>
-        <w:t xml:space="preserve">driver of the exchange rate.</w:t>
-      </w:r>
-    </w:p>
-    <w:p>
-      <w:pPr>
-        <w:pStyle w:val="BodyText"/>
-      </w:pPr>
-      <w:r>
-        <w:rPr>
-          <w:b/>
-          <w:bCs/>
-        </w:rPr>
-        <w:t xml:space="preserve">Emerging markets.</w:t>
-      </w:r>
-      <w:r>
-        <w:t xml:space="preserve"> </w:t>
-      </w:r>
-      <w:r>
-        <w:t xml:space="preserve">Things can look different for emerging markets.</w:t>
-      </w:r>
-      <w:r>
-        <w:t xml:space="preserve"> </w:t>
-      </w:r>
-      <w:r>
-        <w:t xml:space="preserve">Frankel and Poonawala (2010)</w:t>
-      </w:r>
-      <w:r>
-        <w:t xml:space="preserve"> </w:t>
-      </w:r>
-      <w:r>
-        <w:t xml:space="preserve">found that the forward bias is actually smaller for emerging-market</w:t>
-      </w:r>
-      <w:r>
-        <w:t xml:space="preserve"> </w:t>
-      </w:r>
-      <w:r>
-        <w:t xml:space="preserve">currencies than for big currencies. This is useful background when I read my</w:t>
-      </w:r>
-      <w:r>
-        <w:t xml:space="preserve"> </w:t>
-      </w:r>
-      <w:r>
-        <w:t xml:space="preserve">results for the zloty.</w:t>
-      </w:r>
-    </w:p>
-    <w:p>
-      <w:pPr>
-        <w:pStyle w:val="BodyText"/>
-      </w:pPr>
-      <w:r>
-        <w:rPr>
-          <w:b/>
-          <w:bCs/>
-        </w:rPr>
-        <w:t xml:space="preserve">Methods I rely on.</w:t>
-      </w:r>
-      <w:r>
-        <w:t xml:space="preserve"> </w:t>
-      </w:r>
-      <w:r>
-        <w:t xml:space="preserve">For the methods I follow the standard time-series toolkit:</w:t>
-      </w:r>
-      <w:r>
-        <w:t xml:space="preserve"> </w:t>
-      </w:r>
-      <w:r>
-        <w:t xml:space="preserve">unit-root tests</w:t>
-      </w:r>
-      <w:r>
-        <w:t xml:space="preserve"> </w:t>
-      </w:r>
-      <w:r>
-        <w:t xml:space="preserve">(Dickey and Fuller 1979; Kwiatkowski et al. 1992)</w:t>
-      </w:r>
-      <w:r>
-        <w:t xml:space="preserve">, residual-based cointegration</w:t>
-      </w:r>
-      <w:r>
-        <w:t xml:space="preserve"> </w:t>
-      </w:r>
-      <w:r>
-        <w:t xml:space="preserve">tests</w:t>
-      </w:r>
-      <w:r>
-        <w:t xml:space="preserve"> </w:t>
-      </w:r>
-      <w:r>
-        <w:t xml:space="preserve">(Engle and Granger 1987; Phillips and Ouliaris 1990)</w:t>
-      </w:r>
-      <w:r>
-        <w:t xml:space="preserve">, the Johansen</w:t>
-      </w:r>
-      <w:r>
-        <w:t xml:space="preserve"> </w:t>
-      </w:r>
-      <w:r>
-        <w:t xml:space="preserve">(1988)</w:t>
-      </w:r>
-      <w:r>
-        <w:t xml:space="preserve"> </w:t>
-      </w:r>
-      <w:r>
-        <w:t xml:space="preserve">system test, and</w:t>
-      </w:r>
-      <w:r>
-        <w:t xml:space="preserve"> </w:t>
-      </w:r>
-      <w:r>
-        <w:t xml:space="preserve">the ARDL bounds test by</w:t>
-      </w:r>
-      <w:r>
-        <w:t xml:space="preserve"> </w:t>
-      </w:r>
-      <w:r>
-        <w:t xml:space="preserve">Pesaran et al. (2001)</w:t>
-      </w:r>
-      <w:r>
-        <w:t xml:space="preserve">. I lean on the ARDL test because it still</w:t>
-      </w:r>
-      <w:r>
-        <w:t xml:space="preserve"> </w:t>
-      </w:r>
-      <w:r>
-        <w:t xml:space="preserve">works when some variables are stationary and others are not — which is likely</w:t>
-      </w:r>
-      <w:r>
-        <w:t xml:space="preserve"> </w:t>
-      </w:r>
-      <w:r>
-        <w:t xml:space="preserve">here, since interest rate gaps are often close to the border between the two.</w:t>
+        <w:t xml:space="preserve">showed it is very hard to beat.</w:t>
       </w:r>
     </w:p>
     <w:bookmarkEnd w:id="11"/>
@@ -709,13 +619,7 @@
         <w:t xml:space="preserve"> </w:t>
       </w:r>
       <w:r>
-        <w:t xml:space="preserve">— Poland’s main policy rate, set to the value in force at</w:t>
-      </w:r>
-      <w:r>
-        <w:t xml:space="preserve"> </w:t>
-      </w:r>
-      <w:r>
-        <w:t xml:space="preserve">month-end.</w:t>
+        <w:t xml:space="preserve">— Poland’s main policy rate, at month-end.</w:t>
       </w:r>
     </w:p>
     <w:p>
@@ -1190,6 +1094,38 @@
     </w:tbl>
     <w:p>
       <w:pPr>
+        <w:pStyle w:val="BodyText"/>
+      </w:pPr>
+      <w:r>
+        <w:t xml:space="preserve">Figure 1 shows the two main series. The zloty was fairly stable until 2020, then</w:t>
+      </w:r>
+      <w:r>
+        <w:t xml:space="preserve"> </w:t>
+      </w:r>
+      <w:r>
+        <w:t xml:space="preserve">weakened strongly during the pandemic and the 2022 energy shock (the EUR/PLN rate</w:t>
+      </w:r>
+      <w:r>
+        <w:t xml:space="preserve"> </w:t>
+      </w:r>
+      <w:r>
+        <w:t xml:space="preserve">rose toward 4.9), before recovering. The interest rate gap stayed positive for</w:t>
+      </w:r>
+      <w:r>
+        <w:t xml:space="preserve"> </w:t>
+      </w:r>
+      <w:r>
+        <w:t xml:space="preserve">the whole sample — the NBP rate was always above the ECB rate — and spiked to</w:t>
+      </w:r>
+      <w:r>
+        <w:t xml:space="preserve"> </w:t>
+      </w:r>
+      <w:r>
+        <w:t xml:space="preserve">about 6 points in 2022–2023.</w:t>
+      </w:r>
+    </w:p>
+    <w:p>
+      <w:pPr>
         <w:pStyle w:val="CaptionedFigure"/>
       </w:pPr>
       <w:r>
@@ -1197,7 +1133,7 @@
           <wp:inline>
             <wp:extent cx="5334000" cy="4148666"/>
             <wp:effectExtent b="0" l="0" r="0" t="0"/>
-            <wp:docPr descr="EUR/PLN exchange rate and the NBP–ECB interest rate gap." title="" id="13" name="Picture"/>
+            <wp:docPr descr="Figure 1. EUR/PLN exchange rate and the NBP–ECB interest rate gap." title="" id="13" name="Picture"/>
             <a:graphic>
               <a:graphicData uri="http://schemas.openxmlformats.org/drawingml/2006/picture">
                 <pic:pic>
@@ -1240,7 +1176,7 @@
         <w:pStyle w:val="ImageCaption"/>
       </w:pPr>
       <w:r>
-        <w:t xml:space="preserve">EUR/PLN exchange rate and the NBP–ECB interest rate gap.</w:t>
+        <w:t xml:space="preserve">Figure 1. EUR/PLN exchange rate and the NBP–ECB interest rate gap.</w:t>
       </w:r>
     </w:p>
     <w:bookmarkEnd w:id="15"/>
@@ -1285,13 +1221,13 @@
         <w:t xml:space="preserve"> </w:t>
       </w:r>
       <w:r>
-        <w:t xml:space="preserve">First I test if each series is stationary.</w:t>
-      </w:r>
-      <w:r>
-        <w:t xml:space="preserve"> </w:t>
-      </w:r>
-      <w:r>
-        <w:t xml:space="preserve">I use two tests together: the ADF test</w:t>
+        <w:t xml:space="preserve">I test if each series is stationary using two</w:t>
+      </w:r>
+      <w:r>
+        <w:t xml:space="preserve"> </w:t>
+      </w:r>
+      <w:r>
+        <w:t xml:space="preserve">tests together: the ADF test</w:t>
       </w:r>
       <w:r>
         <w:t xml:space="preserve"> </w:t>
@@ -1300,13 +1236,13 @@
         <w:t xml:space="preserve">(Dickey and Fuller 1979)</w:t>
       </w:r>
       <w:r>
-        <w:t xml:space="preserve">, where the null is a unit</w:t>
-      </w:r>
-      <w:r>
-        <w:t xml:space="preserve"> </w:t>
-      </w:r>
-      <w:r>
-        <w:t xml:space="preserve">root (non-stationary), and the KPSS test</w:t>
+        <w:t xml:space="preserve">, where the null is a unit root, and</w:t>
+      </w:r>
+      <w:r>
+        <w:t xml:space="preserve"> </w:t>
+      </w:r>
+      <w:r>
+        <w:t xml:space="preserve">the KPSS test</w:t>
       </w:r>
       <w:r>
         <w:t xml:space="preserve"> </w:t>
@@ -1315,19 +1251,19 @@
         <w:t xml:space="preserve">(Kwiatkowski et al. 1992)</w:t>
       </w:r>
       <w:r>
-        <w:t xml:space="preserve">, where the null is</w:t>
-      </w:r>
-      <w:r>
-        <w:t xml:space="preserve"> </w:t>
-      </w:r>
-      <w:r>
-        <w:t xml:space="preserve">stationary. Using both is safer. I call a series I(1) only if it looks</w:t>
-      </w:r>
-      <w:r>
-        <w:t xml:space="preserve"> </w:t>
-      </w:r>
-      <w:r>
-        <w:t xml:space="preserve">non-stationary in levels but stationary after taking first differences.</w:t>
+        <w:t xml:space="preserve">, where the null is stationary. I call a series</w:t>
+      </w:r>
+      <w:r>
+        <w:t xml:space="preserve"> </w:t>
+      </w:r>
+      <w:r>
+        <w:t xml:space="preserve">I(1) only if it looks non-stationary in levels but stationary after first</w:t>
+      </w:r>
+      <w:r>
+        <w:t xml:space="preserve"> </w:t>
+      </w:r>
+      <w:r>
+        <w:t xml:space="preserve">differencing.</w:t>
       </w:r>
     </w:p>
     <w:p>
@@ -1345,13 +1281,13 @@
         <w:t xml:space="preserve"> </w:t>
       </w:r>
       <w:r>
-        <w:t xml:space="preserve">If the variables are I(1), I check if they</w:t>
-      </w:r>
-      <w:r>
-        <w:t xml:space="preserve"> </w:t>
-      </w:r>
-      <w:r>
-        <w:t xml:space="preserve">move together in the long run. I use the Phillips–Ouliaris test</w:t>
+        <w:t xml:space="preserve">If the variables are I(1), I check whether</w:t>
+      </w:r>
+      <w:r>
+        <w:t xml:space="preserve"> </w:t>
+      </w:r>
+      <w:r>
+        <w:t xml:space="preserve">they move together in the long run, using the Phillips–Ouliaris test</w:t>
       </w:r>
       <w:r>
         <w:t xml:space="preserve"> </w:t>
@@ -1360,13 +1296,10 @@
         <w:t xml:space="preserve">(Phillips and Ouliaris 1990)</w:t>
       </w:r>
       <w:r>
-        <w:t xml:space="preserve">,</w:t>
-      </w:r>
-      <w:r>
-        <w:t xml:space="preserve"> </w:t>
-      </w:r>
-      <w:r>
-        <w:t xml:space="preserve">which is the Engle–Granger</w:t>
+        <w:t xml:space="preserve"> </w:t>
+      </w:r>
+      <w:r>
+        <w:t xml:space="preserve">(the Engle–Granger</w:t>
       </w:r>
       <w:r>
         <w:t xml:space="preserve"> </w:t>
@@ -1378,13 +1311,13 @@
         <w:t xml:space="preserve"> </w:t>
       </w:r>
       <w:r>
-        <w:t xml:space="preserve">idea with the right critical values, and</w:t>
-      </w:r>
-      <w:r>
-        <w:t xml:space="preserve"> </w:t>
-      </w:r>
-      <w:r>
-        <w:t xml:space="preserve">the Johansen</w:t>
+        <w:t xml:space="preserve">idea with the right critical</w:t>
+      </w:r>
+      <w:r>
+        <w:t xml:space="preserve"> </w:t>
+      </w:r>
+      <w:r>
+        <w:t xml:space="preserve">values) and the Johansen</w:t>
       </w:r>
       <w:r>
         <w:t xml:space="preserve"> </w:t>
@@ -1396,7 +1329,7 @@
         <w:t xml:space="preserve"> </w:t>
       </w:r>
       <w:r>
-        <w:t xml:space="preserve">test, which finds how many long-run links exist.</w:t>
+        <w:t xml:space="preserve">test.</w:t>
       </w:r>
     </w:p>
     <w:p>
@@ -1414,13 +1347,13 @@
         <w:t xml:space="preserve"> </w:t>
       </w:r>
       <w:r>
-        <w:t xml:space="preserve">The interest rate gap might be stationary, not</w:t>
-      </w:r>
-      <w:r>
-        <w:t xml:space="preserve"> </w:t>
-      </w:r>
-      <w:r>
-        <w:t xml:space="preserve">I(1). To be safe I use the ARDL bounds test</w:t>
+        <w:t xml:space="preserve">As my main and most robust model I use the ARDL</w:t>
+      </w:r>
+      <w:r>
+        <w:t xml:space="preserve"> </w:t>
+      </w:r>
+      <w:r>
+        <w:t xml:space="preserve">bounds test</w:t>
       </w:r>
       <w:r>
         <w:t xml:space="preserve"> </w:t>
@@ -1429,34 +1362,19 @@
         <w:t xml:space="preserve">(Pesaran et al. 2001)</w:t>
       </w:r>
       <w:r>
-        <w:t xml:space="preserve"> </w:t>
-      </w:r>
-      <w:r>
-        <w:t xml:space="preserve">as my main model. It</w:t>
-      </w:r>
-      <w:r>
-        <w:t xml:space="preserve"> </w:t>
-      </w:r>
-      <w:r>
-        <w:t xml:space="preserve">works with any mix of stationary and non-stationary variables. It gives me the</w:t>
-      </w:r>
-      <w:r>
-        <w:t xml:space="preserve"> </w:t>
-      </w:r>
-      <w:r>
-        <w:t xml:space="preserve">long-run effect and an error-correction model (ECM), which shows how fast the</w:t>
-      </w:r>
-      <w:r>
-        <w:t xml:space="preserve"> </w:t>
-      </w:r>
-      <w:r>
-        <w:t xml:space="preserve">rate returns to its long-run level after a shock. I pick the lag lengths with the</w:t>
-      </w:r>
-      <w:r>
-        <w:t xml:space="preserve"> </w:t>
-      </w:r>
-      <w:r>
-        <w:t xml:space="preserve">AIC.</w:t>
+        <w:t xml:space="preserve">, which works with any mix of stationary and</w:t>
+      </w:r>
+      <w:r>
+        <w:t xml:space="preserve"> </w:t>
+      </w:r>
+      <w:r>
+        <w:t xml:space="preserve">non-stationary variables. It gives the long-run effect and an error-correction</w:t>
+      </w:r>
+      <w:r>
+        <w:t xml:space="preserve"> </w:t>
+      </w:r>
+      <w:r>
+        <w:t xml:space="preserve">model. I choose the lag lengths with the AIC.</w:t>
       </w:r>
     </w:p>
     <w:p>
@@ -1474,25 +1392,19 @@
         <w:t xml:space="preserve"> </w:t>
       </w:r>
       <w:r>
-        <w:t xml:space="preserve">I also fit a simple ARIMA model on the exchange</w:t>
-      </w:r>
-      <w:r>
-        <w:t xml:space="preserve"> </w:t>
-      </w:r>
-      <w:r>
-        <w:t xml:space="preserve">rate alone, keeping the last 12 months aside to test forecasts. This tells me if</w:t>
-      </w:r>
-      <w:r>
-        <w:t xml:space="preserve"> </w:t>
-      </w:r>
-      <w:r>
-        <w:t xml:space="preserve">the interest rate information actually helps, compared to a model that only uses</w:t>
-      </w:r>
-      <w:r>
-        <w:t xml:space="preserve"> </w:t>
-      </w:r>
-      <w:r>
-        <w:t xml:space="preserve">the past of the exchange rate</w:t>
+        <w:t xml:space="preserve">I fit a simple ARIMA model on the exchange rate</w:t>
+      </w:r>
+      <w:r>
+        <w:t xml:space="preserve"> </w:t>
+      </w:r>
+      <w:r>
+        <w:t xml:space="preserve">alone, holding out the last 12 months, to see if the interest rate information</w:t>
+      </w:r>
+      <w:r>
+        <w:t xml:space="preserve"> </w:t>
+      </w:r>
+      <w:r>
+        <w:t xml:space="preserve">beats a pure time-series model</w:t>
       </w:r>
       <w:r>
         <w:t xml:space="preserve"> </w:t>
@@ -1509,35 +1421,23 @@
         <w:pStyle w:val="BodyText"/>
       </w:pPr>
       <w:r>
-        <w:t xml:space="preserve">I finish with checks on the model: tests for leftover correlation in the errors</w:t>
-      </w:r>
-      <w:r>
-        <w:t xml:space="preserve"> </w:t>
-      </w:r>
-      <w:r>
-        <w:t xml:space="preserve">(Breusch–Godfrey), changing variance (Breusch–Pagan), normal errors</w:t>
-      </w:r>
-      <w:r>
-        <w:t xml:space="preserve"> </w:t>
-      </w:r>
-      <w:r>
-        <w:t xml:space="preserve">(Jarque–Bera), and wrong functional form (Ramsey RESET). I also run a</w:t>
-      </w:r>
-      <w:r>
-        <w:t xml:space="preserve"> </w:t>
-      </w:r>
-      <w:r>
-        <w:t xml:space="preserve">Zivot–Andrews test that allows one break in the data, and a CUSUM test for</w:t>
-      </w:r>
-      <w:r>
-        <w:t xml:space="preserve"> </w:t>
-      </w:r>
-      <w:r>
-        <w:t xml:space="preserve">stability over time.</w:t>
+        <w:t xml:space="preserve">I finish with residual checks (Breusch–Godfrey, Breusch–Pagan, Jarque–Bera,</w:t>
+      </w:r>
+      <w:r>
+        <w:t xml:space="preserve"> </w:t>
+      </w:r>
+      <w:r>
+        <w:t xml:space="preserve">Ramsey RESET), a Zivot–Andrews test that allows one break, and a CUSUM stability</w:t>
+      </w:r>
+      <w:r>
+        <w:t xml:space="preserve"> </w:t>
+      </w:r>
+      <w:r>
+        <w:t xml:space="preserve">test.</w:t>
       </w:r>
     </w:p>
     <w:bookmarkEnd w:id="16"/>
-    <w:bookmarkStart w:id="31" w:name="results"/>
+    <w:bookmarkStart w:id="37" w:name="results"/>
     <w:p>
       <w:pPr>
         <w:pStyle w:val="Heading1"/>
@@ -1555,7 +1455,7 @@
         <w:t xml:space="preserve">Results</w:t>
       </w:r>
     </w:p>
-    <w:bookmarkStart w:id="17" w:name="unit-root-tests"/>
+    <w:bookmarkStart w:id="23" w:name="unit-root-tests"/>
     <w:p>
       <w:pPr>
         <w:pStyle w:val="Heading2"/>
@@ -1705,122 +1605,43 @@
         <w:pStyle w:val="BodyText"/>
       </w:pPr>
       <w:r>
-        <w:t xml:space="preserve">[Say which series are I(1). Most importantly, say if the interest rate gap is</w:t>
-      </w:r>
-      <w:r>
-        <w:t xml:space="preserve"> </w:t>
-      </w:r>
-      <w:r>
-        <w:t xml:space="preserve">stationary or not, because this decides whether normal cointegration is allowed</w:t>
-      </w:r>
-      <w:r>
-        <w:t xml:space="preserve"> </w:t>
-      </w:r>
-      <w:r>
-        <w:t xml:space="preserve">or whether only the ARDL bounds test is valid.]</w:t>
-      </w:r>
-    </w:p>
-    <w:bookmarkEnd w:id="17"/>
-    <w:bookmarkStart w:id="18" w:name="cointegration"/>
-    <w:p>
-      <w:pPr>
-        <w:pStyle w:val="Heading2"/>
-      </w:pPr>
-      <w:r>
-        <w:rPr>
-          <w:rStyle w:val="SectionNumber"/>
-        </w:rPr>
-        <w:t xml:space="preserve">6.2</w:t>
-      </w:r>
-      <w:r>
-        <w:tab/>
-      </w:r>
-      <w:r>
-        <w:t xml:space="preserve">Cointegration</w:t>
-      </w:r>
-    </w:p>
-    <w:p>
-      <w:pPr>
-        <w:pStyle w:val="SourceCode"/>
-      </w:pPr>
-      <w:r>
-        <w:rPr>
-          <w:rStyle w:val="VerbatimChar"/>
-        </w:rPr>
-        <w:t xml:space="preserve">## Phillips–Ouliaris statistic: -12.322 | p-value: 0.15</w:t>
-      </w:r>
-    </w:p>
-    <w:p>
-      <w:pPr>
-        <w:pStyle w:val="FirstParagraph"/>
-      </w:pPr>
-      <w:r>
-        <w:t xml:space="preserve">[Report the Johansen result from the console and say how many long-run links</w:t>
-      </w:r>
-      <w:r>
-        <w:t xml:space="preserve"> </w:t>
-      </w:r>
-      <w:r>
-        <w:t xml:space="preserve">there are. Compare it with the bounds test below.]</w:t>
-      </w:r>
-    </w:p>
-    <w:bookmarkEnd w:id="18"/>
-    <w:bookmarkStart w:id="22" w:name="ardl-bounds-test-and-error-correction"/>
-    <w:p>
-      <w:pPr>
-        <w:pStyle w:val="Heading2"/>
-      </w:pPr>
-      <w:r>
-        <w:rPr>
-          <w:rStyle w:val="SectionNumber"/>
-        </w:rPr>
-        <w:t xml:space="preserve">6.3</w:t>
-      </w:r>
-      <w:r>
-        <w:tab/>
-      </w:r>
-      <w:r>
-        <w:t xml:space="preserve">ARDL bounds test and error correction</w:t>
-      </w:r>
-    </w:p>
-    <w:p>
-      <w:pPr>
-        <w:pStyle w:val="SourceCode"/>
-      </w:pPr>
-      <w:r>
-        <w:rPr>
-          <w:rStyle w:val="VerbatimChar"/>
-        </w:rPr>
-        <w:t xml:space="preserve">## ARDL bounds F-statistic: 1.905 </w:t>
-      </w:r>
-      <w:r>
-        <w:br/>
-      </w:r>
-      <w:r>
-        <w:rPr>
-          <w:rStyle w:val="VerbatimChar"/>
-        </w:rPr>
-        <w:t xml:space="preserve">## (Compare with the Pesaran et al. 2001 bounds for case 3.)</w:t>
-      </w:r>
-    </w:p>
-    <w:p>
-      <w:pPr>
-        <w:pStyle w:val="FirstParagraph"/>
-      </w:pPr>
-      <w:r>
-        <w:t xml:space="preserve">[Report the long-run effect of the interest rate gap and the speed-of-adjustment</w:t>
-      </w:r>
-      <w:r>
-        <w:t xml:space="preserve"> </w:t>
-      </w:r>
-      <w:r>
-        <w:t xml:space="preserve">(ECM) term. A negative and significant ECM term means the rate does return to its</w:t>
-      </w:r>
-      <w:r>
-        <w:t xml:space="preserve"> </w:t>
-      </w:r>
-      <w:r>
-        <w:t xml:space="preserve">long-run level; its size tells me how much of the gap closes each month.]</w:t>
+        <w:t xml:space="preserve">All three variables are I(1): non-stationary in levels but stationary after first</w:t>
+      </w:r>
+      <w:r>
+        <w:t xml:space="preserve"> </w:t>
+      </w:r>
+      <w:r>
+        <w:t xml:space="preserve">differencing. Figure 2 shows this clearly for the exchange rate. The ACF of the</w:t>
+      </w:r>
+      <w:r>
+        <w:t xml:space="preserve"> </w:t>
+      </w:r>
+      <w:r>
+        <w:t xml:space="preserve">level falls very slowly (a typical sign of a unit root), while the ACF of the</w:t>
+      </w:r>
+      <w:r>
+        <w:t xml:space="preserve"> </w:t>
+      </w:r>
+      <w:r>
+        <w:t xml:space="preserve">differenced series dies out almost at once, and the differenced series in</w:t>
+      </w:r>
+      <w:r>
+        <w:t xml:space="preserve"> </w:t>
+      </w:r>
+      <w:r>
+        <w:t xml:space="preserve">Figure 3 looks like noise around zero. Because the interest rate gap is also</w:t>
+      </w:r>
+      <w:r>
+        <w:t xml:space="preserve"> </w:t>
+      </w:r>
+      <w:r>
+        <w:t xml:space="preserve">I(1), I am allowed to run the cointegration tests, and I still use the ARDL</w:t>
+      </w:r>
+      <w:r>
+        <w:t xml:space="preserve"> </w:t>
+      </w:r>
+      <w:r>
+        <w:t xml:space="preserve">bounds test as a robustness check.</w:t>
       </w:r>
     </w:p>
     <w:p>
@@ -1830,20 +1651,75 @@
       <w:r>
         <w:drawing>
           <wp:inline>
-            <wp:extent cx="5334000" cy="2963333"/>
+            <wp:extent cx="5334000" cy="4148666"/>
             <wp:effectExtent b="0" l="0" r="0" t="0"/>
-            <wp:docPr descr="ARDL model: actual vs fitted log EUR/PLN." title="" id="20" name="Picture"/>
+            <wp:docPr descr="Figure 2. ACF and PACF of log EUR/PLN, in levels and first differences." title="" id="18" name="Picture"/>
             <a:graphic>
               <a:graphicData uri="http://schemas.openxmlformats.org/drawingml/2006/picture">
                 <pic:pic>
                   <pic:nvPicPr>
-                    <pic:cNvPr descr="output//fig5_ardl_fit.png" id="21" name="Picture"/>
+                    <pic:cNvPr descr="output//fig4_acf_pacf.png" id="19" name="Picture"/>
                     <pic:cNvPicPr>
                       <a:picLocks noChangeArrowheads="1" noChangeAspect="1"/>
                     </pic:cNvPicPr>
                   </pic:nvPicPr>
                   <pic:blipFill>
-                    <a:blip r:embed="rId19"/>
+                    <a:blip r:embed="rId17"/>
+                    <a:stretch>
+                      <a:fillRect/>
+                    </a:stretch>
+                  </pic:blipFill>
+                  <pic:spPr bwMode="auto">
+                    <a:xfrm>
+                      <a:off x="0" y="0"/>
+                      <a:ext cx="5334000" cy="4148666"/>
+                    </a:xfrm>
+                    <a:prstGeom prst="rect">
+                      <a:avLst/>
+                    </a:prstGeom>
+                    <a:noFill/>
+                    <a:ln w="9525">
+                      <a:noFill/>
+                      <a:headEnd/>
+                      <a:tailEnd/>
+                    </a:ln>
+                  </pic:spPr>
+                </pic:pic>
+              </a:graphicData>
+            </a:graphic>
+          </wp:inline>
+        </w:drawing>
+      </w:r>
+    </w:p>
+    <w:p>
+      <w:pPr>
+        <w:pStyle w:val="ImageCaption"/>
+      </w:pPr>
+      <w:r>
+        <w:t xml:space="preserve">Figure 2. ACF and PACF of log EUR/PLN, in levels and first differences.</w:t>
+      </w:r>
+    </w:p>
+    <w:p>
+      <w:pPr>
+        <w:pStyle w:val="CaptionedFigure"/>
+      </w:pPr>
+      <w:r>
+        <w:drawing>
+          <wp:inline>
+            <wp:extent cx="5334000" cy="2963333"/>
+            <wp:effectExtent b="0" l="0" r="0" t="0"/>
+            <wp:docPr descr="Figure 3. First difference of log EUR/PLN (monthly log-returns)." title="" id="21" name="Picture"/>
+            <a:graphic>
+              <a:graphicData uri="http://schemas.openxmlformats.org/drawingml/2006/picture">
+                <pic:pic>
+                  <pic:nvPicPr>
+                    <pic:cNvPr descr="output//fig3_returns.png" id="22" name="Picture"/>
+                    <pic:cNvPicPr>
+                      <a:picLocks noChangeArrowheads="1" noChangeAspect="1"/>
+                    </pic:cNvPicPr>
+                  </pic:nvPicPr>
+                  <pic:blipFill>
+                    <a:blip r:embed="rId20"/>
                     <a:stretch>
                       <a:fillRect/>
                     </a:stretch>
@@ -1875,11 +1751,11 @@
         <w:pStyle w:val="ImageCaption"/>
       </w:pPr>
       <w:r>
-        <w:t xml:space="preserve">ARDL model: actual vs fitted log EUR/PLN.</w:t>
-      </w:r>
-    </w:p>
-    <w:bookmarkEnd w:id="22"/>
-    <w:bookmarkStart w:id="26" w:name="arima-benchmark"/>
+        <w:t xml:space="preserve">Figure 3. First difference of log EUR/PLN (monthly log-returns).</w:t>
+      </w:r>
+    </w:p>
+    <w:bookmarkEnd w:id="23"/>
+    <w:bookmarkStart w:id="24" w:name="cointegration"/>
     <w:p>
       <w:pPr>
         <w:pStyle w:val="Heading2"/>
@@ -1888,372 +1764,163 @@
         <w:rPr>
           <w:rStyle w:val="SectionNumber"/>
         </w:rPr>
-        <w:t xml:space="preserve">6.4</w:t>
+        <w:t xml:space="preserve">6.2</w:t>
       </w:r>
       <w:r>
         <w:tab/>
       </w:r>
       <w:r>
-        <w:t xml:space="preserve">ARIMA benchmark</w:t>
-      </w:r>
-    </w:p>
-    <w:p>
-      <w:pPr>
-        <w:pStyle w:val="TableCaption"/>
-      </w:pPr>
-      <w:r>
-        <w:t xml:space="preserve">ARIMA forecast accuracy (last 12 months).</w:t>
-      </w:r>
-    </w:p>
-    <w:tbl>
-      <w:tblPr>
-        <w:tblStyle w:val="Table"/>
-        <w:tblW w:type="pct" w:w="5000"/>
-        <w:tblLayout w:type="fixed"/>
-        <w:tblLook w:firstRow="1" w:lastRow="0" w:firstColumn="0" w:lastColumn="0" w:noHBand="0" w:noVBand="0" w:val="0020"/>
-        <w:tblCaption w:val="ARIMA forecast accuracy (last 12 months)."/>
-      </w:tblPr>
-      <w:tblGrid>
-        <w:gridCol w:w="1391"/>
-        <w:gridCol w:w="749"/>
-        <w:gridCol w:w="749"/>
-        <w:gridCol w:w="749"/>
-        <w:gridCol w:w="856"/>
-        <w:gridCol w:w="749"/>
-        <w:gridCol w:w="749"/>
-        <w:gridCol w:w="856"/>
-        <w:gridCol w:w="1070"/>
-      </w:tblGrid>
-      <w:tr>
-        <w:trPr>
-          <w:tblHeader w:val="on"/>
-        </w:trPr>
-        <w:tc>
-          <w:tcPr/>
-          <w:p>
-            <w:pPr>
-              <w:pStyle w:val="Compact"/>
-            </w:pPr>
-          </w:p>
-        </w:tc>
-        <w:tc>
-          <w:tcPr/>
-          <w:p>
-            <w:pPr>
-              <w:pStyle w:val="Compact"/>
-              <w:jc w:val="right"/>
-            </w:pPr>
-            <w:r>
-              <w:t xml:space="preserve">ME</w:t>
-            </w:r>
-          </w:p>
-        </w:tc>
-        <w:tc>
-          <w:tcPr/>
-          <w:p>
-            <w:pPr>
-              <w:pStyle w:val="Compact"/>
-              <w:jc w:val="right"/>
-            </w:pPr>
-            <w:r>
-              <w:t xml:space="preserve">RMSE</w:t>
-            </w:r>
-          </w:p>
-        </w:tc>
-        <w:tc>
-          <w:tcPr/>
-          <w:p>
-            <w:pPr>
-              <w:pStyle w:val="Compact"/>
-              <w:jc w:val="right"/>
-            </w:pPr>
-            <w:r>
-              <w:t xml:space="preserve">MAE</w:t>
-            </w:r>
-          </w:p>
-        </w:tc>
-        <w:tc>
-          <w:tcPr/>
-          <w:p>
-            <w:pPr>
-              <w:pStyle w:val="Compact"/>
-              <w:jc w:val="right"/>
-            </w:pPr>
-            <w:r>
-              <w:t xml:space="preserve">MPE</w:t>
-            </w:r>
-          </w:p>
-        </w:tc>
-        <w:tc>
-          <w:tcPr/>
-          <w:p>
-            <w:pPr>
-              <w:pStyle w:val="Compact"/>
-              <w:jc w:val="right"/>
-            </w:pPr>
-            <w:r>
-              <w:t xml:space="preserve">MAPE</w:t>
-            </w:r>
-          </w:p>
-        </w:tc>
-        <w:tc>
-          <w:tcPr/>
-          <w:p>
-            <w:pPr>
-              <w:pStyle w:val="Compact"/>
-              <w:jc w:val="right"/>
-            </w:pPr>
-            <w:r>
-              <w:t xml:space="preserve">MASE</w:t>
-            </w:r>
-          </w:p>
-        </w:tc>
-        <w:tc>
-          <w:tcPr/>
-          <w:p>
-            <w:pPr>
-              <w:pStyle w:val="Compact"/>
-              <w:jc w:val="right"/>
-            </w:pPr>
-            <w:r>
-              <w:t xml:space="preserve">ACF1</w:t>
-            </w:r>
-          </w:p>
-        </w:tc>
-        <w:tc>
-          <w:tcPr/>
-          <w:p>
-            <w:pPr>
-              <w:pStyle w:val="Compact"/>
-              <w:jc w:val="right"/>
-            </w:pPr>
-            <w:r>
-              <w:t xml:space="preserve">Theil’s U</w:t>
-            </w:r>
-          </w:p>
-        </w:tc>
-      </w:tr>
-      <w:tr>
-        <w:tc>
-          <w:tcPr/>
-          <w:p>
-            <w:pPr>
-              <w:pStyle w:val="Compact"/>
-              <w:jc w:val="left"/>
-            </w:pPr>
-            <w:r>
-              <w:t xml:space="preserve">Training set</w:t>
-            </w:r>
-          </w:p>
-        </w:tc>
-        <w:tc>
-          <w:tcPr/>
-          <w:p>
-            <w:pPr>
-              <w:pStyle w:val="Compact"/>
-              <w:jc w:val="right"/>
-            </w:pPr>
-            <w:r>
-              <w:t xml:space="preserve">0.0001</w:t>
-            </w:r>
-          </w:p>
-        </w:tc>
-        <w:tc>
-          <w:tcPr/>
-          <w:p>
-            <w:pPr>
-              <w:pStyle w:val="Compact"/>
-              <w:jc w:val="right"/>
-            </w:pPr>
-            <w:r>
-              <w:t xml:space="preserve">0.0154</w:t>
-            </w:r>
-          </w:p>
-        </w:tc>
-        <w:tc>
-          <w:tcPr/>
-          <w:p>
-            <w:pPr>
-              <w:pStyle w:val="Compact"/>
-              <w:jc w:val="right"/>
-            </w:pPr>
-            <w:r>
-              <w:t xml:space="preserve">0.0119</w:t>
-            </w:r>
-          </w:p>
-        </w:tc>
-        <w:tc>
-          <w:tcPr/>
-          <w:p>
-            <w:pPr>
-              <w:pStyle w:val="Compact"/>
-              <w:jc w:val="right"/>
-            </w:pPr>
-            <w:r>
-              <w:t xml:space="preserve">-0.0032</w:t>
-            </w:r>
-          </w:p>
-        </w:tc>
-        <w:tc>
-          <w:tcPr/>
-          <w:p>
-            <w:pPr>
-              <w:pStyle w:val="Compact"/>
-              <w:jc w:val="right"/>
-            </w:pPr>
-            <w:r>
-              <w:t xml:space="preserve">0.8107</w:t>
-            </w:r>
-          </w:p>
-        </w:tc>
-        <w:tc>
-          <w:tcPr/>
-          <w:p>
-            <w:pPr>
-              <w:pStyle w:val="Compact"/>
-              <w:jc w:val="right"/>
-            </w:pPr>
-            <w:r>
-              <w:t xml:space="preserve">0.4330</w:t>
-            </w:r>
-          </w:p>
-        </w:tc>
-        <w:tc>
-          <w:tcPr/>
-          <w:p>
-            <w:pPr>
-              <w:pStyle w:val="Compact"/>
-              <w:jc w:val="right"/>
-            </w:pPr>
-            <w:r>
-              <w:t xml:space="preserve">-0.0034</w:t>
-            </w:r>
-          </w:p>
-        </w:tc>
-        <w:tc>
-          <w:tcPr/>
-          <w:p>
-            <w:pPr>
-              <w:pStyle w:val="Compact"/>
-              <w:jc w:val="right"/>
-            </w:pPr>
-            <w:r>
-              <w:t xml:space="preserve">NA</w:t>
-            </w:r>
-          </w:p>
-        </w:tc>
-      </w:tr>
-      <w:tr>
-        <w:tc>
-          <w:tcPr/>
-          <w:p>
-            <w:pPr>
-              <w:pStyle w:val="Compact"/>
-              <w:jc w:val="left"/>
-            </w:pPr>
-            <w:r>
-              <w:t xml:space="preserve">Test set</w:t>
-            </w:r>
-          </w:p>
-        </w:tc>
-        <w:tc>
-          <w:tcPr/>
-          <w:p>
-            <w:pPr>
-              <w:pStyle w:val="Compact"/>
-              <w:jc w:val="right"/>
-            </w:pPr>
-            <w:r>
-              <w:t xml:space="preserve">0.0023</w:t>
-            </w:r>
-          </w:p>
-        </w:tc>
-        <w:tc>
-          <w:tcPr/>
-          <w:p>
-            <w:pPr>
-              <w:pStyle w:val="Compact"/>
-              <w:jc w:val="right"/>
-            </w:pPr>
-            <w:r>
-              <w:t xml:space="preserve">0.0055</w:t>
-            </w:r>
-          </w:p>
-        </w:tc>
-        <w:tc>
-          <w:tcPr/>
-          <w:p>
-            <w:pPr>
-              <w:pStyle w:val="Compact"/>
-              <w:jc w:val="right"/>
-            </w:pPr>
-            <w:r>
-              <w:t xml:space="preserve">0.0046</w:t>
-            </w:r>
-          </w:p>
-        </w:tc>
-        <w:tc>
-          <w:tcPr/>
-          <w:p>
-            <w:pPr>
-              <w:pStyle w:val="Compact"/>
-              <w:jc w:val="right"/>
-            </w:pPr>
-            <w:r>
-              <w:t xml:space="preserve">0.1581</w:t>
-            </w:r>
-          </w:p>
-        </w:tc>
-        <w:tc>
-          <w:tcPr/>
-          <w:p>
-            <w:pPr>
-              <w:pStyle w:val="Compact"/>
-              <w:jc w:val="right"/>
-            </w:pPr>
-            <w:r>
-              <w:t xml:space="preserve">0.3197</w:t>
-            </w:r>
-          </w:p>
-        </w:tc>
-        <w:tc>
-          <w:tcPr/>
-          <w:p>
-            <w:pPr>
-              <w:pStyle w:val="Compact"/>
-              <w:jc w:val="right"/>
-            </w:pPr>
-            <w:r>
-              <w:t xml:space="preserve">0.1679</w:t>
-            </w:r>
-          </w:p>
-        </w:tc>
-        <w:tc>
-          <w:tcPr/>
-          <w:p>
-            <w:pPr>
-              <w:pStyle w:val="Compact"/>
-              <w:jc w:val="right"/>
-            </w:pPr>
-            <w:r>
-              <w:t xml:space="preserve">0.3647</w:t>
-            </w:r>
-          </w:p>
-        </w:tc>
-        <w:tc>
-          <w:tcPr/>
-          <w:p>
-            <w:pPr>
-              <w:pStyle w:val="Compact"/>
-              <w:jc w:val="right"/>
-            </w:pPr>
-            <w:r>
-              <w:t xml:space="preserve">0.9724</w:t>
-            </w:r>
-          </w:p>
-        </w:tc>
-      </w:tr>
-    </w:tbl>
+        <w:t xml:space="preserve">Cointegration</w:t>
+      </w:r>
+    </w:p>
+    <w:p>
+      <w:pPr>
+        <w:pStyle w:val="SourceCode"/>
+      </w:pPr>
+      <w:r>
+        <w:rPr>
+          <w:rStyle w:val="VerbatimChar"/>
+        </w:rPr>
+        <w:t xml:space="preserve">Phillips-Ouliaris statistic: -12.322 | p-value: 0.15 </w:t>
+      </w:r>
+    </w:p>
+    <w:p>
+      <w:pPr>
+        <w:pStyle w:val="FirstParagraph"/>
+      </w:pPr>
+      <w:r>
+        <w:t xml:space="preserve">The Phillips–Ouliaris test gives a p-value of about 0.15, so I cannot reject the</w:t>
+      </w:r>
+      <w:r>
+        <w:t xml:space="preserve"> </w:t>
+      </w:r>
+      <w:r>
+        <w:t xml:space="preserve">null of no cointegration. The Johansen trace test points the same way: I do not</w:t>
+      </w:r>
+      <w:r>
+        <w:t xml:space="preserve"> </w:t>
+      </w:r>
+      <w:r>
+        <w:t xml:space="preserve">find a clear long-run vector at the 5% level. In short, the level of the exchange</w:t>
+      </w:r>
+      <w:r>
+        <w:t xml:space="preserve"> </w:t>
+      </w:r>
+      <w:r>
+        <w:t xml:space="preserve">rate and the level of the interest rate gap do not seem to share a stable</w:t>
+      </w:r>
+      <w:r>
+        <w:t xml:space="preserve"> </w:t>
+      </w:r>
+      <w:r>
+        <w:t xml:space="preserve">long-run path.</w:t>
+      </w:r>
+    </w:p>
+    <w:bookmarkEnd w:id="24"/>
+    <w:bookmarkStart w:id="28" w:name="ardl-bounds-test-and-error-correction"/>
+    <w:p>
+      <w:pPr>
+        <w:pStyle w:val="Heading2"/>
+      </w:pPr>
+      <w:r>
+        <w:rPr>
+          <w:rStyle w:val="SectionNumber"/>
+        </w:rPr>
+        <w:t xml:space="preserve">6.3</w:t>
+      </w:r>
+      <w:r>
+        <w:tab/>
+      </w:r>
+      <w:r>
+        <w:t xml:space="preserve">ARDL bounds test and error correction</w:t>
+      </w:r>
+    </w:p>
+    <w:p>
+      <w:pPr>
+        <w:pStyle w:val="SourceCode"/>
+      </w:pPr>
+      <w:r>
+        <w:rPr>
+          <w:rStyle w:val="VerbatimChar"/>
+        </w:rPr>
+        <w:t xml:space="preserve">ARDL bounds F-statistic: 1.905 </w:t>
+      </w:r>
+    </w:p>
+    <w:p>
+      <w:pPr>
+        <w:pStyle w:val="FirstParagraph"/>
+      </w:pPr>
+      <w:r>
+        <w:t xml:space="preserve">The bounds F-statistic is about 1.9. This is</w:t>
+      </w:r>
+      <w:r>
+        <w:t xml:space="preserve"> </w:t>
+      </w:r>
+      <w:r>
+        <w:rPr>
+          <w:b/>
+          <w:bCs/>
+        </w:rPr>
+        <w:t xml:space="preserve">below</w:t>
+      </w:r>
+      <w:r>
+        <w:t xml:space="preserve"> </w:t>
+      </w:r>
+      <w:r>
+        <w:t xml:space="preserve">the lower Pesaran et al.</w:t>
+      </w:r>
+      <w:r>
+        <w:t xml:space="preserve"> </w:t>
+      </w:r>
+      <w:r>
+        <w:t xml:space="preserve">(2001) critical bound (around 3–4 at the usual 5–10% levels for two regressors),</w:t>
+      </w:r>
+      <w:r>
+        <w:t xml:space="preserve"> </w:t>
+      </w:r>
+      <w:r>
+        <w:t xml:space="preserve">so once again I cannot reject</w:t>
+      </w:r>
+      <w:r>
+        <w:t xml:space="preserve"> </w:t>
+      </w:r>
+      <w:r>
+        <w:t xml:space="preserve">“no long-run relationship”</w:t>
+      </w:r>
+      <w:r>
+        <w:t xml:space="preserve">. The ARDL model still</w:t>
+      </w:r>
+      <w:r>
+        <w:t xml:space="preserve"> </w:t>
+      </w:r>
+      <w:r>
+        <w:t xml:space="preserve">tracks the data very closely in-sample (Figure 4), but this good fit comes mostly</w:t>
+      </w:r>
+      <w:r>
+        <w:t xml:space="preserve"> </w:t>
+      </w:r>
+      <w:r>
+        <w:t xml:space="preserve">from the lagged exchange rate itself, not from the interest rate gap — the</w:t>
+      </w:r>
+      <w:r>
+        <w:t xml:space="preserve"> </w:t>
+      </w:r>
+      <w:r>
+        <w:t xml:space="preserve">exchange rate mainly explains itself. Because I find no long-run link, the</w:t>
+      </w:r>
+      <w:r>
+        <w:t xml:space="preserve"> </w:t>
+      </w:r>
+      <w:r>
+        <w:t xml:space="preserve">error-correction term is not meaningful here, so I do not read a speed of</w:t>
+      </w:r>
+      <w:r>
+        <w:t xml:space="preserve"> </w:t>
+      </w:r>
+      <w:r>
+        <w:t xml:space="preserve">adjustment from it.</w:t>
+      </w:r>
+    </w:p>
     <w:p>
       <w:pPr>
         <w:pStyle w:val="CaptionedFigure"/>
@@ -2263,18 +1930,18 @@
           <wp:inline>
             <wp:extent cx="5334000" cy="2963333"/>
             <wp:effectExtent b="0" l="0" r="0" t="0"/>
-            <wp:docPr descr="ARIMA forecast vs real values." title="" id="24" name="Picture"/>
+            <wp:docPr descr="Figure 4. ARDL model: actual vs fitted log EUR/PLN." title="" id="26" name="Picture"/>
             <a:graphic>
               <a:graphicData uri="http://schemas.openxmlformats.org/drawingml/2006/picture">
                 <pic:pic>
                   <pic:nvPicPr>
-                    <pic:cNvPr descr="output//fig6_arima_forecast.png" id="25" name="Picture"/>
+                    <pic:cNvPr descr="output//fig5_ardl_fit.png" id="27" name="Picture"/>
                     <pic:cNvPicPr>
                       <a:picLocks noChangeArrowheads="1" noChangeAspect="1"/>
                     </pic:cNvPicPr>
                   </pic:nvPicPr>
                   <pic:blipFill>
-                    <a:blip r:embed="rId23"/>
+                    <a:blip r:embed="rId25"/>
                     <a:stretch>
                       <a:fillRect/>
                     </a:stretch>
@@ -2306,11 +1973,11 @@
         <w:pStyle w:val="ImageCaption"/>
       </w:pPr>
       <w:r>
-        <w:t xml:space="preserve">ARIMA forecast vs real values.</w:t>
-      </w:r>
-    </w:p>
-    <w:bookmarkEnd w:id="26"/>
-    <w:bookmarkStart w:id="30" w:name="diagnostics-and-stability"/>
+        <w:t xml:space="preserve">Figure 4. ARDL model: actual vs fitted log EUR/PLN.</w:t>
+      </w:r>
+    </w:p>
+    <w:bookmarkEnd w:id="28"/>
+    <w:bookmarkStart w:id="32" w:name="arima-benchmark"/>
     <w:p>
       <w:pPr>
         <w:pStyle w:val="Heading2"/>
@@ -2319,33 +1986,411 @@
         <w:rPr>
           <w:rStyle w:val="SectionNumber"/>
         </w:rPr>
-        <w:t xml:space="preserve">6.5</w:t>
+        <w:t xml:space="preserve">6.4</w:t>
       </w:r>
       <w:r>
         <w:tab/>
       </w:r>
       <w:r>
-        <w:t xml:space="preserve">Diagnostics and stability</w:t>
-      </w:r>
-    </w:p>
-    <w:p>
-      <w:pPr>
-        <w:pStyle w:val="FirstParagraph"/>
-      </w:pPr>
-      <w:r>
-        <w:t xml:space="preserve">[Summarise the checks (Breusch–Godfrey, Breusch–Pagan, Jarque–Bera, RESET), the</w:t>
-      </w:r>
-      <w:r>
-        <w:t xml:space="preserve"> </w:t>
-      </w:r>
-      <w:r>
-        <w:t xml:space="preserve">break date from the Zivot–Andrews test, and the CUSUM plot. Say if the 2022–2023</w:t>
-      </w:r>
-      <w:r>
-        <w:t xml:space="preserve"> </w:t>
-      </w:r>
-      <w:r>
-        <w:t xml:space="preserve">rate-hike period shows up as a break.]</w:t>
+        <w:t xml:space="preserve">ARIMA benchmark</w:t>
+      </w:r>
+    </w:p>
+    <w:p>
+      <w:pPr>
+        <w:pStyle w:val="TableCaption"/>
+      </w:pPr>
+      <w:r>
+        <w:t xml:space="preserve">ARIMA forecast accuracy (last 12 months).</w:t>
+      </w:r>
+    </w:p>
+    <w:tbl>
+      <w:tblPr>
+        <w:tblStyle w:val="Table"/>
+        <w:tblW w:type="pct" w:w="5000"/>
+        <w:tblLayout w:type="fixed"/>
+        <w:tblLook w:firstRow="1" w:lastRow="0" w:firstColumn="0" w:lastColumn="0" w:noHBand="0" w:noVBand="0" w:val="0020"/>
+        <w:tblCaption w:val="ARIMA forecast accuracy (last 12 months)."/>
+      </w:tblPr>
+      <w:tblGrid>
+        <w:gridCol w:w="1391"/>
+        <w:gridCol w:w="749"/>
+        <w:gridCol w:w="749"/>
+        <w:gridCol w:w="749"/>
+        <w:gridCol w:w="856"/>
+        <w:gridCol w:w="749"/>
+        <w:gridCol w:w="749"/>
+        <w:gridCol w:w="856"/>
+        <w:gridCol w:w="1070"/>
+      </w:tblGrid>
+      <w:tr>
+        <w:trPr>
+          <w:tblHeader w:val="on"/>
+        </w:trPr>
+        <w:tc>
+          <w:tcPr/>
+          <w:p>
+            <w:pPr>
+              <w:pStyle w:val="Compact"/>
+            </w:pPr>
+          </w:p>
+        </w:tc>
+        <w:tc>
+          <w:tcPr/>
+          <w:p>
+            <w:pPr>
+              <w:pStyle w:val="Compact"/>
+              <w:jc w:val="right"/>
+            </w:pPr>
+            <w:r>
+              <w:t xml:space="preserve">ME</w:t>
+            </w:r>
+          </w:p>
+        </w:tc>
+        <w:tc>
+          <w:tcPr/>
+          <w:p>
+            <w:pPr>
+              <w:pStyle w:val="Compact"/>
+              <w:jc w:val="right"/>
+            </w:pPr>
+            <w:r>
+              <w:t xml:space="preserve">RMSE</w:t>
+            </w:r>
+          </w:p>
+        </w:tc>
+        <w:tc>
+          <w:tcPr/>
+          <w:p>
+            <w:pPr>
+              <w:pStyle w:val="Compact"/>
+              <w:jc w:val="right"/>
+            </w:pPr>
+            <w:r>
+              <w:t xml:space="preserve">MAE</w:t>
+            </w:r>
+          </w:p>
+        </w:tc>
+        <w:tc>
+          <w:tcPr/>
+          <w:p>
+            <w:pPr>
+              <w:pStyle w:val="Compact"/>
+              <w:jc w:val="right"/>
+            </w:pPr>
+            <w:r>
+              <w:t xml:space="preserve">MPE</w:t>
+            </w:r>
+          </w:p>
+        </w:tc>
+        <w:tc>
+          <w:tcPr/>
+          <w:p>
+            <w:pPr>
+              <w:pStyle w:val="Compact"/>
+              <w:jc w:val="right"/>
+            </w:pPr>
+            <w:r>
+              <w:t xml:space="preserve">MAPE</w:t>
+            </w:r>
+          </w:p>
+        </w:tc>
+        <w:tc>
+          <w:tcPr/>
+          <w:p>
+            <w:pPr>
+              <w:pStyle w:val="Compact"/>
+              <w:jc w:val="right"/>
+            </w:pPr>
+            <w:r>
+              <w:t xml:space="preserve">MASE</w:t>
+            </w:r>
+          </w:p>
+        </w:tc>
+        <w:tc>
+          <w:tcPr/>
+          <w:p>
+            <w:pPr>
+              <w:pStyle w:val="Compact"/>
+              <w:jc w:val="right"/>
+            </w:pPr>
+            <w:r>
+              <w:t xml:space="preserve">ACF1</w:t>
+            </w:r>
+          </w:p>
+        </w:tc>
+        <w:tc>
+          <w:tcPr/>
+          <w:p>
+            <w:pPr>
+              <w:pStyle w:val="Compact"/>
+              <w:jc w:val="right"/>
+            </w:pPr>
+            <w:r>
+              <w:t xml:space="preserve">Theil’s U</w:t>
+            </w:r>
+          </w:p>
+        </w:tc>
+      </w:tr>
+      <w:tr>
+        <w:tc>
+          <w:tcPr/>
+          <w:p>
+            <w:pPr>
+              <w:pStyle w:val="Compact"/>
+              <w:jc w:val="left"/>
+            </w:pPr>
+            <w:r>
+              <w:t xml:space="preserve">Training set</w:t>
+            </w:r>
+          </w:p>
+        </w:tc>
+        <w:tc>
+          <w:tcPr/>
+          <w:p>
+            <w:pPr>
+              <w:pStyle w:val="Compact"/>
+              <w:jc w:val="right"/>
+            </w:pPr>
+            <w:r>
+              <w:t xml:space="preserve">0.0001</w:t>
+            </w:r>
+          </w:p>
+        </w:tc>
+        <w:tc>
+          <w:tcPr/>
+          <w:p>
+            <w:pPr>
+              <w:pStyle w:val="Compact"/>
+              <w:jc w:val="right"/>
+            </w:pPr>
+            <w:r>
+              <w:t xml:space="preserve">0.0154</w:t>
+            </w:r>
+          </w:p>
+        </w:tc>
+        <w:tc>
+          <w:tcPr/>
+          <w:p>
+            <w:pPr>
+              <w:pStyle w:val="Compact"/>
+              <w:jc w:val="right"/>
+            </w:pPr>
+            <w:r>
+              <w:t xml:space="preserve">0.0119</w:t>
+            </w:r>
+          </w:p>
+        </w:tc>
+        <w:tc>
+          <w:tcPr/>
+          <w:p>
+            <w:pPr>
+              <w:pStyle w:val="Compact"/>
+              <w:jc w:val="right"/>
+            </w:pPr>
+            <w:r>
+              <w:t xml:space="preserve">-0.0032</w:t>
+            </w:r>
+          </w:p>
+        </w:tc>
+        <w:tc>
+          <w:tcPr/>
+          <w:p>
+            <w:pPr>
+              <w:pStyle w:val="Compact"/>
+              <w:jc w:val="right"/>
+            </w:pPr>
+            <w:r>
+              <w:t xml:space="preserve">0.8107</w:t>
+            </w:r>
+          </w:p>
+        </w:tc>
+        <w:tc>
+          <w:tcPr/>
+          <w:p>
+            <w:pPr>
+              <w:pStyle w:val="Compact"/>
+              <w:jc w:val="right"/>
+            </w:pPr>
+            <w:r>
+              <w:t xml:space="preserve">0.4330</w:t>
+            </w:r>
+          </w:p>
+        </w:tc>
+        <w:tc>
+          <w:tcPr/>
+          <w:p>
+            <w:pPr>
+              <w:pStyle w:val="Compact"/>
+              <w:jc w:val="right"/>
+            </w:pPr>
+            <w:r>
+              <w:t xml:space="preserve">-0.0034</w:t>
+            </w:r>
+          </w:p>
+        </w:tc>
+        <w:tc>
+          <w:tcPr/>
+          <w:p>
+            <w:pPr>
+              <w:pStyle w:val="Compact"/>
+              <w:jc w:val="right"/>
+            </w:pPr>
+            <w:r>
+              <w:t xml:space="preserve">NA</w:t>
+            </w:r>
+          </w:p>
+        </w:tc>
+      </w:tr>
+      <w:tr>
+        <w:tc>
+          <w:tcPr/>
+          <w:p>
+            <w:pPr>
+              <w:pStyle w:val="Compact"/>
+              <w:jc w:val="left"/>
+            </w:pPr>
+            <w:r>
+              <w:t xml:space="preserve">Test set</w:t>
+            </w:r>
+          </w:p>
+        </w:tc>
+        <w:tc>
+          <w:tcPr/>
+          <w:p>
+            <w:pPr>
+              <w:pStyle w:val="Compact"/>
+              <w:jc w:val="right"/>
+            </w:pPr>
+            <w:r>
+              <w:t xml:space="preserve">0.0023</w:t>
+            </w:r>
+          </w:p>
+        </w:tc>
+        <w:tc>
+          <w:tcPr/>
+          <w:p>
+            <w:pPr>
+              <w:pStyle w:val="Compact"/>
+              <w:jc w:val="right"/>
+            </w:pPr>
+            <w:r>
+              <w:t xml:space="preserve">0.0055</w:t>
+            </w:r>
+          </w:p>
+        </w:tc>
+        <w:tc>
+          <w:tcPr/>
+          <w:p>
+            <w:pPr>
+              <w:pStyle w:val="Compact"/>
+              <w:jc w:val="right"/>
+            </w:pPr>
+            <w:r>
+              <w:t xml:space="preserve">0.0046</w:t>
+            </w:r>
+          </w:p>
+        </w:tc>
+        <w:tc>
+          <w:tcPr/>
+          <w:p>
+            <w:pPr>
+              <w:pStyle w:val="Compact"/>
+              <w:jc w:val="right"/>
+            </w:pPr>
+            <w:r>
+              <w:t xml:space="preserve">0.1581</w:t>
+            </w:r>
+          </w:p>
+        </w:tc>
+        <w:tc>
+          <w:tcPr/>
+          <w:p>
+            <w:pPr>
+              <w:pStyle w:val="Compact"/>
+              <w:jc w:val="right"/>
+            </w:pPr>
+            <w:r>
+              <w:t xml:space="preserve">0.3197</w:t>
+            </w:r>
+          </w:p>
+        </w:tc>
+        <w:tc>
+          <w:tcPr/>
+          <w:p>
+            <w:pPr>
+              <w:pStyle w:val="Compact"/>
+              <w:jc w:val="right"/>
+            </w:pPr>
+            <w:r>
+              <w:t xml:space="preserve">0.1679</w:t>
+            </w:r>
+          </w:p>
+        </w:tc>
+        <w:tc>
+          <w:tcPr/>
+          <w:p>
+            <w:pPr>
+              <w:pStyle w:val="Compact"/>
+              <w:jc w:val="right"/>
+            </w:pPr>
+            <w:r>
+              <w:t xml:space="preserve">0.3647</w:t>
+            </w:r>
+          </w:p>
+        </w:tc>
+        <w:tc>
+          <w:tcPr/>
+          <w:p>
+            <w:pPr>
+              <w:pStyle w:val="Compact"/>
+              <w:jc w:val="right"/>
+            </w:pPr>
+            <w:r>
+              <w:t xml:space="preserve">0.9724</w:t>
+            </w:r>
+          </w:p>
+        </w:tc>
+      </w:tr>
+    </w:tbl>
+    <w:p>
+      <w:pPr>
+        <w:pStyle w:val="BodyText"/>
+      </w:pPr>
+      <w:r>
+        <w:t xml:space="preserve">The ARIMA model forecasts an almost flat path (Figure 5). On the 12-month test</w:t>
+      </w:r>
+      <w:r>
+        <w:t xml:space="preserve"> </w:t>
+      </w:r>
+      <w:r>
+        <w:t xml:space="preserve">set the errors are small (MAPE about 0.3%) and Theil’s U is about 0.97 — just</w:t>
+      </w:r>
+      <w:r>
+        <w:t xml:space="preserve"> </w:t>
+      </w:r>
+      <w:r>
+        <w:t xml:space="preserve">under 1. A value close to 1 means the model is only slightly better than a naive</w:t>
+      </w:r>
+      <w:r>
+        <w:t xml:space="preserve"> </w:t>
+      </w:r>
+      <w:r>
+        <w:t xml:space="preserve">random-walk forecast. This matches</w:t>
+      </w:r>
+      <w:r>
+        <w:t xml:space="preserve"> </w:t>
+      </w:r>
+      <w:r>
+        <w:t xml:space="preserve">Meese and Rogoff (1983)</w:t>
+      </w:r>
+      <w:r>
+        <w:t xml:space="preserve">: the exchange rate is very hard to</w:t>
+      </w:r>
+      <w:r>
+        <w:t xml:space="preserve"> </w:t>
+      </w:r>
+      <w:r>
+        <w:t xml:space="preserve">beat with a simple model, and the interest rate gap does not clearly help.</w:t>
       </w:r>
     </w:p>
     <w:p>
@@ -2357,18 +2402,18 @@
           <wp:inline>
             <wp:extent cx="5334000" cy="2963333"/>
             <wp:effectExtent b="0" l="0" r="0" t="0"/>
-            <wp:docPr descr="CUSUM stability test." title="" id="28" name="Picture"/>
+            <wp:docPr descr="Figure 5. ARIMA forecast vs realised values." title="" id="30" name="Picture"/>
             <a:graphic>
               <a:graphicData uri="http://schemas.openxmlformats.org/drawingml/2006/picture">
                 <pic:pic>
                   <pic:nvPicPr>
-                    <pic:cNvPr descr="output//fig7_cusum.png" id="29" name="Picture"/>
+                    <pic:cNvPr descr="output//fig6_arima_forecast.png" id="31" name="Picture"/>
                     <pic:cNvPicPr>
                       <a:picLocks noChangeArrowheads="1" noChangeAspect="1"/>
                     </pic:cNvPicPr>
                   </pic:nvPicPr>
                   <pic:blipFill>
-                    <a:blip r:embed="rId27"/>
+                    <a:blip r:embed="rId29"/>
                     <a:stretch>
                       <a:fillRect/>
                     </a:stretch>
@@ -2400,12 +2445,130 @@
         <w:pStyle w:val="ImageCaption"/>
       </w:pPr>
       <w:r>
-        <w:t xml:space="preserve">CUSUM stability test.</w:t>
-      </w:r>
-    </w:p>
-    <w:bookmarkEnd w:id="30"/>
-    <w:bookmarkEnd w:id="31"/>
-    <w:bookmarkStart w:id="32" w:name="conclusion"/>
+        <w:t xml:space="preserve">Figure 5. ARIMA forecast vs realised values.</w:t>
+      </w:r>
+    </w:p>
+    <w:bookmarkEnd w:id="32"/>
+    <w:bookmarkStart w:id="36" w:name="diagnostics-and-stability"/>
+    <w:p>
+      <w:pPr>
+        <w:pStyle w:val="Heading2"/>
+      </w:pPr>
+      <w:r>
+        <w:rPr>
+          <w:rStyle w:val="SectionNumber"/>
+        </w:rPr>
+        <w:t xml:space="preserve">6.5</w:t>
+      </w:r>
+      <w:r>
+        <w:tab/>
+      </w:r>
+      <w:r>
+        <w:t xml:space="preserve">Diagnostics and stability</w:t>
+      </w:r>
+    </w:p>
+    <w:p>
+      <w:pPr>
+        <w:pStyle w:val="FirstParagraph"/>
+      </w:pPr>
+      <w:r>
+        <w:t xml:space="preserve">The residual checks are broadly acceptable. The clearest result is about</w:t>
+      </w:r>
+      <w:r>
+        <w:t xml:space="preserve"> </w:t>
+      </w:r>
+      <w:r>
+        <w:t xml:space="preserve">stability: the OLS-CUSUM line in Figure 6 moves far outside its red confidence</w:t>
+      </w:r>
+      <w:r>
+        <w:t xml:space="preserve"> </w:t>
+      </w:r>
+      <w:r>
+        <w:t xml:space="preserve">bands, and the Zivot–Andrews test finds a structural break around the 2020–2022</w:t>
+      </w:r>
+      <w:r>
+        <w:t xml:space="preserve"> </w:t>
+      </w:r>
+      <w:r>
+        <w:t xml:space="preserve">period. This is exactly when the pandemic hit and then the NBP raised rates</w:t>
+      </w:r>
+      <w:r>
+        <w:t xml:space="preserve"> </w:t>
+      </w:r>
+      <w:r>
+        <w:t xml:space="preserve">sharply. So even if there were a short-run link between the variables, it did not</w:t>
+      </w:r>
+      <w:r>
+        <w:t xml:space="preserve"> </w:t>
+      </w:r>
+      <w:r>
+        <w:t xml:space="preserve">stay stable across the whole sample — which is another reason the long-run tests</w:t>
+      </w:r>
+      <w:r>
+        <w:t xml:space="preserve"> </w:t>
+      </w:r>
+      <w:r>
+        <w:t xml:space="preserve">do not find a fixed relationship.</w:t>
+      </w:r>
+    </w:p>
+    <w:p>
+      <w:pPr>
+        <w:pStyle w:val="CaptionedFigure"/>
+      </w:pPr>
+      <w:r>
+        <w:drawing>
+          <wp:inline>
+            <wp:extent cx="5334000" cy="2963333"/>
+            <wp:effectExtent b="0" l="0" r="0" t="0"/>
+            <wp:docPr descr="Figure 6. OLS-CUSUM stability test of the long-run relationship." title="" id="34" name="Picture"/>
+            <a:graphic>
+              <a:graphicData uri="http://schemas.openxmlformats.org/drawingml/2006/picture">
+                <pic:pic>
+                  <pic:nvPicPr>
+                    <pic:cNvPr descr="output//fig7_cusum.png" id="35" name="Picture"/>
+                    <pic:cNvPicPr>
+                      <a:picLocks noChangeArrowheads="1" noChangeAspect="1"/>
+                    </pic:cNvPicPr>
+                  </pic:nvPicPr>
+                  <pic:blipFill>
+                    <a:blip r:embed="rId33"/>
+                    <a:stretch>
+                      <a:fillRect/>
+                    </a:stretch>
+                  </pic:blipFill>
+                  <pic:spPr bwMode="auto">
+                    <a:xfrm>
+                      <a:off x="0" y="0"/>
+                      <a:ext cx="5334000" cy="2963333"/>
+                    </a:xfrm>
+                    <a:prstGeom prst="rect">
+                      <a:avLst/>
+                    </a:prstGeom>
+                    <a:noFill/>
+                    <a:ln w="9525">
+                      <a:noFill/>
+                      <a:headEnd/>
+                      <a:tailEnd/>
+                    </a:ln>
+                  </pic:spPr>
+                </pic:pic>
+              </a:graphicData>
+            </a:graphic>
+          </wp:inline>
+        </w:drawing>
+      </w:r>
+    </w:p>
+    <w:p>
+      <w:pPr>
+        <w:pStyle w:val="ImageCaption"/>
+      </w:pPr>
+      <w:r>
+        <w:t xml:space="preserve">Figure 6. OLS-CUSUM stability test of the long-run relationship.</w:t>
+      </w:r>
+    </w:p>
+    <w:bookmarkEnd w:id="36"/>
+    <w:bookmarkEnd w:id="37"/>
+    <w:bookmarkStart w:id="38" w:name="conclusion"/>
     <w:p>
       <w:pPr>
         <w:pStyle w:val="Heading1"/>
@@ -2428,35 +2591,94 @@
         <w:pStyle w:val="FirstParagraph"/>
       </w:pPr>
       <w:r>
-        <w:t xml:space="preserve">[State the main finding in one or two sentences: whether the EUR/PLN rate and the</w:t>
-      </w:r>
-      <w:r>
-        <w:t xml:space="preserve"> </w:t>
-      </w:r>
-      <w:r>
-        <w:t xml:space="preserve">interest rate gap have a long-run link, the direction of the effect, and how fast</w:t>
-      </w:r>
-      <w:r>
-        <w:t xml:space="preserve"> </w:t>
-      </w:r>
-      <w:r>
-        <w:t xml:space="preserve">the rate adjusts. Then mention the limits of the study — I use nominal rates, I do</w:t>
-      </w:r>
-      <w:r>
-        <w:t xml:space="preserve"> </w:t>
-      </w:r>
-      <w:r>
-        <w:t xml:space="preserve">not model the risk premium, and I allow only one break — and suggest next steps,</w:t>
-      </w:r>
-      <w:r>
-        <w:t xml:space="preserve"> </w:t>
-      </w:r>
-      <w:r>
-        <w:t xml:space="preserve">such as a nonlinear ARDL or adding a risk measure like the VIX.]</w:t>
-      </w:r>
-    </w:p>
-    <w:bookmarkEnd w:id="32"/>
-    <w:bookmarkStart w:id="45" w:name="references"/>
+        <w:t xml:space="preserve">Over 2012–2026 I do not find a stable long-run link between the EUR/PLN rate and</w:t>
+      </w:r>
+      <w:r>
+        <w:t xml:space="preserve"> </w:t>
+      </w:r>
+      <w:r>
+        <w:t xml:space="preserve">the NBP–ECB interest rate gap. All three series are I(1), but the cointegration</w:t>
+      </w:r>
+      <w:r>
+        <w:t xml:space="preserve"> </w:t>
+      </w:r>
+      <w:r>
+        <w:t xml:space="preserve">tests (Phillips–Ouliaris and Johansen) and the ARDL bounds test all point to no</w:t>
+      </w:r>
+      <w:r>
+        <w:t xml:space="preserve"> </w:t>
+      </w:r>
+      <w:r>
+        <w:t xml:space="preserve">long-run relationship, and the stability tests show a clear break around</w:t>
+      </w:r>
+      <w:r>
+        <w:t xml:space="preserve"> </w:t>
+      </w:r>
+      <w:r>
+        <w:t xml:space="preserve">2020–2022. The exchange rate behaves close to a random walk, and a simple ARIMA</w:t>
+      </w:r>
+      <w:r>
+        <w:t xml:space="preserve"> </w:t>
+      </w:r>
+      <w:r>
+        <w:t xml:space="preserve">model is only marginally better than a naive forecast. This result fits the wider</w:t>
+      </w:r>
+      <w:r>
+        <w:t xml:space="preserve"> </w:t>
+      </w:r>
+      <w:r>
+        <w:t xml:space="preserve">literature, where interest-parity links are weak and exchange rates are hard to</w:t>
+      </w:r>
+      <w:r>
+        <w:t xml:space="preserve"> </w:t>
+      </w:r>
+      <w:r>
+        <w:t xml:space="preserve">forecast</w:t>
+      </w:r>
+      <w:r>
+        <w:t xml:space="preserve"> </w:t>
+      </w:r>
+      <w:r>
+        <w:t xml:space="preserve">(Meese and Rogoff 1983; Fama 1984)</w:t>
+      </w:r>
+      <w:r>
+        <w:t xml:space="preserve">.</w:t>
+      </w:r>
+    </w:p>
+    <w:p>
+      <w:pPr>
+        <w:pStyle w:val="BodyText"/>
+      </w:pPr>
+      <w:r>
+        <w:t xml:space="preserve">The study has limits. I use nominal interest rates rather than real ones; I do</w:t>
+      </w:r>
+      <w:r>
+        <w:t xml:space="preserve"> </w:t>
+      </w:r>
+      <w:r>
+        <w:t xml:space="preserve">not model the risk premium that matters for emerging-market currencies; and I</w:t>
+      </w:r>
+      <w:r>
+        <w:t xml:space="preserve"> </w:t>
+      </w:r>
+      <w:r>
+        <w:t xml:space="preserve">allow only one structural break. Useful next steps would be a nonlinear or</w:t>
+      </w:r>
+      <w:r>
+        <w:t xml:space="preserve"> </w:t>
+      </w:r>
+      <w:r>
+        <w:t xml:space="preserve">regime-switching ARDL model, using real interest rates, or adding a risk measure</w:t>
+      </w:r>
+      <w:r>
+        <w:t xml:space="preserve"> </w:t>
+      </w:r>
+      <w:r>
+        <w:t xml:space="preserve">such as the VIX to capture global risk sentiment.</w:t>
+      </w:r>
+    </w:p>
+    <w:bookmarkEnd w:id="38"/>
+    <w:bookmarkStart w:id="51" w:name="references"/>
     <w:p>
       <w:pPr>
         <w:pStyle w:val="Heading1"/>
@@ -2465,8 +2687,8 @@
         <w:t xml:space="preserve">References</w:t>
       </w:r>
     </w:p>
-    <w:bookmarkStart w:id="44" w:name="refs"/>
-    <w:bookmarkStart w:id="33" w:name="ref-chinn2004"/>
+    <w:bookmarkStart w:id="50" w:name="refs"/>
+    <w:bookmarkStart w:id="39" w:name="ref-chinn2004"/>
     <w:p>
       <w:pPr>
         <w:pStyle w:val="Bibliography"/>
@@ -2497,8 +2719,8 @@
         <w:t xml:space="preserve">51 (3): 409–30.</w:t>
       </w:r>
     </w:p>
-    <w:bookmarkEnd w:id="33"/>
-    <w:bookmarkStart w:id="34" w:name="ref-dickey1979"/>
+    <w:bookmarkEnd w:id="39"/>
+    <w:bookmarkStart w:id="40" w:name="ref-dickey1979"/>
     <w:p>
       <w:pPr>
         <w:pStyle w:val="Bibliography"/>
@@ -2529,8 +2751,8 @@
         <w:t xml:space="preserve">74 (366): 427–31.</w:t>
       </w:r>
     </w:p>
-    <w:bookmarkEnd w:id="34"/>
-    <w:bookmarkStart w:id="35" w:name="ref-engle1987"/>
+    <w:bookmarkEnd w:id="40"/>
+    <w:bookmarkStart w:id="41" w:name="ref-engle1987"/>
     <w:p>
       <w:pPr>
         <w:pStyle w:val="Bibliography"/>
@@ -2561,8 +2783,8 @@
         <w:t xml:space="preserve">55 (2): 251–76.</w:t>
       </w:r>
     </w:p>
-    <w:bookmarkEnd w:id="35"/>
-    <w:bookmarkStart w:id="36" w:name="ref-fama1984"/>
+    <w:bookmarkEnd w:id="41"/>
+    <w:bookmarkStart w:id="42" w:name="ref-fama1984"/>
     <w:p>
       <w:pPr>
         <w:pStyle w:val="Bibliography"/>
@@ -2593,8 +2815,8 @@
         <w:t xml:space="preserve">14 (3): 319–38.</w:t>
       </w:r>
     </w:p>
-    <w:bookmarkEnd w:id="36"/>
-    <w:bookmarkStart w:id="37" w:name="ref-frankel2010"/>
+    <w:bookmarkEnd w:id="42"/>
+    <w:bookmarkStart w:id="43" w:name="ref-frankel2010"/>
     <w:p>
       <w:pPr>
         <w:pStyle w:val="Bibliography"/>
@@ -2625,8 +2847,8 @@
         <w:t xml:space="preserve">29 (3): 585–98.</w:t>
       </w:r>
     </w:p>
-    <w:bookmarkEnd w:id="37"/>
-    <w:bookmarkStart w:id="38" w:name="ref-johansen1988"/>
+    <w:bookmarkEnd w:id="43"/>
+    <w:bookmarkStart w:id="44" w:name="ref-johansen1988"/>
     <w:p>
       <w:pPr>
         <w:pStyle w:val="Bibliography"/>
@@ -2657,8 +2879,8 @@
         <w:t xml:space="preserve">12 (2–3): 231–54.</w:t>
       </w:r>
     </w:p>
-    <w:bookmarkEnd w:id="38"/>
-    <w:bookmarkStart w:id="39" w:name="ref-kwiatkowski1992"/>
+    <w:bookmarkEnd w:id="44"/>
+    <w:bookmarkStart w:id="45" w:name="ref-kwiatkowski1992"/>
     <w:p>
       <w:pPr>
         <w:pStyle w:val="Bibliography"/>
@@ -2689,8 +2911,8 @@
         <w:t xml:space="preserve">54 (1–3): 159–78.</w:t>
       </w:r>
     </w:p>
-    <w:bookmarkEnd w:id="39"/>
-    <w:bookmarkStart w:id="40" w:name="ref-macdonald2000"/>
+    <w:bookmarkEnd w:id="45"/>
+    <w:bookmarkStart w:id="46" w:name="ref-macdonald2000"/>
     <w:p>
       <w:pPr>
         <w:pStyle w:val="Bibliography"/>
@@ -2721,8 +2943,8 @@
         <w:t xml:space="preserve">47 (1): 116–28.</w:t>
       </w:r>
     </w:p>
-    <w:bookmarkEnd w:id="40"/>
-    <w:bookmarkStart w:id="41" w:name="ref-meese1983"/>
+    <w:bookmarkEnd w:id="46"/>
+    <w:bookmarkStart w:id="47" w:name="ref-meese1983"/>
     <w:p>
       <w:pPr>
         <w:pStyle w:val="Bibliography"/>
@@ -2753,8 +2975,8 @@
         <w:t xml:space="preserve">14 (1–2): 3–24.</w:t>
       </w:r>
     </w:p>
-    <w:bookmarkEnd w:id="41"/>
-    <w:bookmarkStart w:id="42" w:name="ref-pesaran2001"/>
+    <w:bookmarkEnd w:id="47"/>
+    <w:bookmarkStart w:id="48" w:name="ref-pesaran2001"/>
     <w:p>
       <w:pPr>
         <w:pStyle w:val="Bibliography"/>
@@ -2785,8 +3007,8 @@
         <w:t xml:space="preserve">16 (3): 289–326.</w:t>
       </w:r>
     </w:p>
-    <w:bookmarkEnd w:id="42"/>
-    <w:bookmarkStart w:id="43" w:name="ref-phillips1990"/>
+    <w:bookmarkEnd w:id="48"/>
+    <w:bookmarkStart w:id="49" w:name="ref-phillips1990"/>
     <w:p>
       <w:pPr>
         <w:pStyle w:val="Bibliography"/>
@@ -2817,9 +3039,9 @@
         <w:t xml:space="preserve">58 (1): 165–93.</w:t>
       </w:r>
     </w:p>
-    <w:bookmarkEnd w:id="43"/>
-    <w:bookmarkEnd w:id="44"/>
-    <w:bookmarkEnd w:id="45"/>
+    <w:bookmarkEnd w:id="49"/>
+    <w:bookmarkEnd w:id="50"/>
+    <w:bookmarkEnd w:id="51"/>
     <w:sectPr>
       <w:footnotePr>
         <w:numRestart w:val="eachSect"/>

</xml_diff>

<commit_message>
vault backup: 2026-06-07 16:05:16
</commit_message>
<xml_diff>
--- a/Spring 2026/2400-DS1AE # Advanced Econometrics/eurpln_project/04_report.docx
+++ b/Spring 2026/2400-DS1AE # Advanced Econometrics/eurpln_project/04_report.docx
@@ -139,13 +139,13 @@
         <w:t xml:space="preserve"> </w:t>
       </w:r>
       <w:r>
-        <w:t xml:space="preserve">ARDL bounds test both reject a long-run relationship, and the stability tests</w:t>
-      </w:r>
-      <w:r>
-        <w:t xml:space="preserve"> </w:t>
-      </w:r>
-      <w:r>
-        <w:t xml:space="preserve">show the link breaks around 2020–2022. The exchange rate behaves close to a</w:t>
+        <w:t xml:space="preserve">ARDL bounds test both point to no long-run relationship, and the stability tests</w:t>
+      </w:r>
+      <w:r>
+        <w:t xml:space="preserve"> </w:t>
+      </w:r>
+      <w:r>
+        <w:t xml:space="preserve">show the link is not stable around 2020–2022. The exchange rate behaves close to a</w:t>
       </w:r>
       <w:r>
         <w:t xml:space="preserve"> </w:t>
@@ -1795,25 +1795,25 @@
         <w:t xml:space="preserve"> </w:t>
       </w:r>
       <w:r>
-        <w:t xml:space="preserve">null of no cointegration. The Johansen trace test points the same way: I do not</w:t>
-      </w:r>
-      <w:r>
-        <w:t xml:space="preserve"> </w:t>
-      </w:r>
-      <w:r>
-        <w:t xml:space="preserve">find a clear long-run vector at the 5% level. In short, the level of the exchange</w:t>
-      </w:r>
-      <w:r>
-        <w:t xml:space="preserve"> </w:t>
-      </w:r>
-      <w:r>
-        <w:t xml:space="preserve">rate and the level of the interest rate gap do not seem to share a stable</w:t>
-      </w:r>
-      <w:r>
-        <w:t xml:space="preserve"> </w:t>
-      </w:r>
-      <w:r>
-        <w:t xml:space="preserve">long-run path.</w:t>
+        <w:t xml:space="preserve">null of no cointegration. The Johansen trace test gives the same overall message</w:t>
+      </w:r>
+      <w:r>
+        <w:t xml:space="preserve"> </w:t>
+      </w:r>
+      <w:r>
+        <w:t xml:space="preserve">and does not point to a stable long-run relationship either. In short, the level</w:t>
+      </w:r>
+      <w:r>
+        <w:t xml:space="preserve"> </w:t>
+      </w:r>
+      <w:r>
+        <w:t xml:space="preserve">of the exchange rate and the level of the interest rate gap do not seem to share</w:t>
+      </w:r>
+      <w:r>
+        <w:t xml:space="preserve"> </w:t>
+      </w:r>
+      <w:r>
+        <w:t xml:space="preserve">a stable long-run path.</w:t>
       </w:r>
     </w:p>
     <w:bookmarkEnd w:id="24"/>

</xml_diff>